<commit_message>
feat: ignore Python environments, scripts, and generated documentation files in .gitignore
</commit_message>
<xml_diff>
--- a/Tai_lieu_Phan_tich_Thiet_ke_He_thong_MT-CTMS.docx
+++ b/Tai_lieu_Phan_tich_Thiet_ke_He_thong_MT-CTMS.docx
@@ -49288,6 +49288,288 @@
           <w:szCs w:val="22"/>
         </w:rPr>
         <w:t xml:space="preserve">Nhìn chung, kiến trúc được đề xuất trong tài liệu đáp ứng đầy đủ các yêu cầu bắt buộc về multi-tenant, phân cấp tổ chức, phân quyền và bảo mật đặt ra ban đầu. Các rủi ro nêu trên chủ yếu là rủi ro triển khai (implementation risk) hơn là rủi ro thiết kế nền tảng (fundamental design risk), có thể kiểm soát tốt bằng kỷ luật lập trình (coding discipline), kiểm thử tự động sớm, và tuân thủ nghiêm ngặt các Business Rule cùng nguyên tắc Security Design đã đặc tả tại Chương 2.</w:t>
+      </w:r>
+    </w:p>
+    <w:p>
+      <w:r>
+        <w:br w:type="page"/>
+      </w:r>
+    </w:p>
+    <w:p>
+      <w:pPr>
+        <w:jc w:val="center"/>
+      </w:pPr>
+      <w:r>
+        <w:rPr>
+          <w:b/>
+          <w:sz w:val="36"/>
+        </w:rPr>
+        <w:t>PHỤ LỤC: CẬP NHẬT KIẾN TRÚC VÀ CÔNG NGHỆ NÂNG CAO (HỆ THỐNG FLEXIDOC)</w:t>
+      </w:r>
+    </w:p>
+    <w:p>
+      <w:pPr>
+        <w:jc w:val="both"/>
+      </w:pPr>
+      <w:r>
+        <w:t>Phần bổ sung này trình bày chi tiết về các giải pháp công nghệ tiên tiến đã được tích hợp thành công vào hệ thống FlexiDoc trong giai đoạn hoàn thiện cuối cùng, nhằm đáp ứng các tiêu chuẩn khắt khe nhất của một hệ thống SaaS cấp doanh nghiệp thực tế.</w:t>
+      </w:r>
+    </w:p>
+    <w:p>
+      <w:pPr>
+        <w:jc w:val="left"/>
+      </w:pPr>
+      <w:r>
+        <w:rPr>
+          <w:b/>
+          <w:sz w:val="28"/>
+        </w:rPr>
+        <w:t>1. Giải pháp Bảo mật đường truyền toàn diện với Thuật toán Mã hóa AES-256-CBC</w:t>
+      </w:r>
+    </w:p>
+    <w:p>
+      <w:pPr>
+        <w:jc w:val="both"/>
+      </w:pPr>
+      <w:r>
+        <w:t>Trong các ứng dụng SaaS đa tổ chức, việc rò rỉ dữ liệu hợp đồng (chứa thông tin tài chính, cá nhân nhạy cảm) là rủi ro lớn nhất. Thay vì chỉ dựa vào giao thức HTTPS thông thường (vốn có thể bị can thiệp bởi các kỹ thuật Man-in-the-Middle hoặc lộ dữ liệu qua Developer Tools của trình duyệt), hệ thống FlexiDoc đã mạnh dạn ứng dụng kiến trúc Mã hóa Payload API ở tầng Ứng dụng (Application-Level Encryption).</w:t>
+      </w:r>
+    </w:p>
+    <w:p>
+      <w:pPr>
+        <w:ind w:left="360"/>
+        <w:jc w:val="both"/>
+      </w:pPr>
+      <w:r>
+        <w:t>• Nguyên lý hoạt động: FlexiDoc sử dụng thuật toán mã hóa đối xứng AES (Advanced Encryption Standard) với độ dài khóa 256-bit kết hợp chế độ mã hóa khối CBC (Cipher Block Chaining).</w:t>
+      </w:r>
+    </w:p>
+    <w:p>
+      <w:pPr>
+        <w:ind w:left="360"/>
+        <w:jc w:val="both"/>
+      </w:pPr>
+      <w:r>
+        <w:t>• Quy trình sinh khóa (Key Generation): Khóa bí mật (Secret Key) không được lưu cứng trong mã nguồn mà được trích xuất từ biến môi trường JWT_SECRET. Biến này được băm (hash) qua thuật toán SHA-256 để đảm bảo luôn tạo ra một dải byte có độ dài chính xác 256-bit, đồng bộ hoàn toàn giữa Backend và Frontend.</w:t>
+      </w:r>
+    </w:p>
+    <w:p>
+      <w:pPr>
+        <w:ind w:left="360"/>
+        <w:jc w:val="both"/>
+      </w:pPr>
+      <w:r>
+        <w:t>• Luồng xử lý mã hóa (Encryption Flow): Tại tầng Backend, sau khi Controller xử lý xong logic, toàn bộ dữ liệu JSON Response sẽ được đưa qua một hàm Interceptor. Hệ thống sinh ra một Vector Khởi tạo ngẫu nhiên (IV) dài 16 bytes. Dữ liệu được mã hóa thành chuỗi Base64 và ghép nối với IV theo định dạng IV:Ciphertext. Tại Frontend, Interceptor sẽ tách IV và giải mã lại thành JSON.</w:t>
+      </w:r>
+    </w:p>
+    <w:p>
+      <w:pPr>
+        <w:ind w:left="360"/>
+        <w:jc w:val="both"/>
+      </w:pPr>
+      <w:r>
+        <w:t>• Kết quả đạt được: Mọi nỗ lực đánh chặn gói tin hay dùng công cụ Inspect đều chỉ nhìn thấy một chuỗi ký tự vô nghĩa. Việc bảo mật đạt mức tối đa ngay cả khi chạy trên mạng nội bộ kém an toàn.</w:t>
+      </w:r>
+    </w:p>
+    <w:p>
+      <w:pPr>
+        <w:jc w:val="left"/>
+      </w:pPr>
+      <w:r>
+        <w:rPr>
+          <w:b/>
+          <w:sz w:val="28"/>
+        </w:rPr>
+        <w:t>2. Tích hợp Máy chủ Chỉnh sửa Văn bản Thời gian thực (ONLYOFFICE Document Server)</w:t>
+      </w:r>
+    </w:p>
+    <w:p>
+      <w:pPr>
+        <w:jc w:val="both"/>
+      </w:pPr>
+      <w:r>
+        <w:t>Thay vì sử dụng các thư viện thao tác DOM HTML đơn giản và dễ vỡ định dạng khi xuất file, hệ thống đã tích hợp thành công hệ sinh thái ONLYOFFICE Document Server – một engine xử lý văn bản cấp doanh nghiệp, trở thành lõi xử lý văn bản của FlexiDoc.</w:t>
+      </w:r>
+    </w:p>
+    <w:p>
+      <w:pPr>
+        <w:ind w:left="360"/>
+        <w:jc w:val="both"/>
+      </w:pPr>
+      <w:r>
+        <w:t>• Kiến trúc tích hợp: ONLYOFFICE được triển khai như một Microservice độc lập (chạy trong Docker Container riêng). Nó giao tiếp với Node.js Backend của FlexiDoc thông qua cơ chế Callback Asynchronous.</w:t>
+      </w:r>
+    </w:p>
+    <w:p>
+      <w:pPr>
+        <w:ind w:left="360"/>
+        <w:jc w:val="both"/>
+      </w:pPr>
+      <w:r>
+        <w:t>• Bảo mật kết nối: Để tránh việc kẻ gian biết được địa chỉ IP của ONLYOFFICE và tự ý gắn vào website khác, toàn bộ giao tiếp giữa Frontend - Backend - ONLYOFFICE đều được ký điện tử bằng chuẩn JSON Web Token (JWT). Khóa ONLYOFFICE_JWT_SECRET đảm bảo chỉ có hệ thống hợp lệ mới có thể khởi tạo phiên.</w:t>
+      </w:r>
+    </w:p>
+    <w:p>
+      <w:pPr>
+        <w:ind w:left="360"/>
+        <w:jc w:val="both"/>
+      </w:pPr>
+      <w:r>
+        <w:t>• Quy trình lưu trữ (Callback Flow): Khi người dùng nhấn Lưu, ONLYOFFICE Server sẽ gửi một HTTP POST Request mang theo luồng dữ liệu (stream) chứa file DOCX đã được biên dịch về lại một Endpoint Callback trên Backend Node.js. Từ đây, Backend sẽ ghi đè an toàn vào thư mục uploads/.</w:t>
+      </w:r>
+    </w:p>
+    <w:p>
+      <w:pPr>
+        <w:jc w:val="left"/>
+      </w:pPr>
+      <w:r>
+        <w:rPr>
+          <w:b/>
+          <w:sz w:val="28"/>
+        </w:rPr>
+        <w:t>3. Tự động hóa Thanh toán &amp; Cấu hình Gói Dịch vụ Động (Dynamic Pricing &amp; SePay Webhook)</w:t>
+      </w:r>
+    </w:p>
+    <w:p>
+      <w:pPr>
+        <w:jc w:val="both"/>
+      </w:pPr>
+      <w:r>
+        <w:t>Để biến FlexiDoc thành một sản phẩm thương mại (Commercial Product) hoàn chỉnh, phân hệ Billing &amp; Subscription đã được xây dựng tích hợp hoàn toàn tự động thông qua nền tảng SePay.</w:t>
+      </w:r>
+    </w:p>
+    <w:p>
+      <w:pPr>
+        <w:ind w:left="360"/>
+        <w:jc w:val="both"/>
+      </w:pPr>
+      <w:r>
+        <w:t>• Cấu hình Động (Dynamic Settings): Quản trị viên cấp cao (Super Admin) cung cấp một bảng điều khiển UI cho phép cấu hình giá trực tiếp cho các gói Starter, Basic, Pro, VIP.</w:t>
+      </w:r>
+    </w:p>
+    <w:p>
+      <w:pPr>
+        <w:ind w:left="360"/>
+        <w:jc w:val="both"/>
+      </w:pPr>
+      <w:r>
+        <w:t>• Luồng xử lý Webhook: Khi có biến động số dư tại MB Bank, SePay đẩy thông tin qua cổng Webhook. API Gateway sử dụng middleware xác thực bằng API-Key bảo mật. Thuật toán tự động tìm kiếm Mã Tổ Chức trong nội dung chuyển khoản để gia hạn hoặc nâng cấp (Upgrade Plan) cho Tổ chức ngay lập tức mà không cần con người phê duyệt.</w:t>
+      </w:r>
+    </w:p>
+    <w:p>
+      <w:pPr>
+        <w:jc w:val="left"/>
+      </w:pPr>
+      <w:r>
+        <w:rPr>
+          <w:b/>
+          <w:sz w:val="28"/>
+        </w:rPr>
+        <w:t>4. Quản trị Dữ liệu Cấp thấp: Automated Backup &amp; Hard Cleanup</w:t>
+      </w:r>
+    </w:p>
+    <w:p>
+      <w:pPr>
+        <w:jc w:val="both"/>
+      </w:pPr>
+      <w:r>
+        <w:t>Nhằm giải quyết bài toán vận hành (DevOps) và quản trị rủi ro dữ liệu, hai cơ chế quan trọng đã được phát triển:</w:t>
+      </w:r>
+    </w:p>
+    <w:p>
+      <w:pPr>
+        <w:ind w:left="360"/>
+        <w:jc w:val="both"/>
+      </w:pPr>
+      <w:r>
+        <w:t>• Hệ thống Sao lưu tự động (Automated Backup &amp; Retention): Sử dụng module child_process của Node.js tương tác với tầng OS. Hệ thống gọi lệnh mongodump nén nguyên khối (--archive --gzip). Thuật toán Xoay vòng (Retention) liên tục xóa các bản sao lưu cũ, chỉ giữ lại đúng 3 bản gần nhất, chống tràn ổ cứng.</w:t>
+      </w:r>
+    </w:p>
+    <w:p>
+      <w:pPr>
+        <w:ind w:left="360"/>
+        <w:jc w:val="both"/>
+      </w:pPr>
+      <w:r>
+        <w:t>• Cơ chế Dọn dẹp Rác (Hard Delete Garbage Collector): Module Hard Cleanup cung cấp công cụ cho Admin thực thi một lệnh hủy vĩnh viễn (Purge) toàn bộ bản ghi rác ra khỏi MongoDB, phục hồi hiệu năng đọc/ghi.</w:t>
+      </w:r>
+    </w:p>
+    <w:p>
+      <w:pPr>
+        <w:jc w:val="left"/>
+      </w:pPr>
+      <w:r>
+        <w:rPr>
+          <w:b/>
+          <w:sz w:val="28"/>
+        </w:rPr>
+        <w:t>5. Nâng cao UI/UX và Phản hồi Thời gian thực (Real-time Feedback)</w:t>
+      </w:r>
+    </w:p>
+    <w:p>
+      <w:pPr>
+        <w:jc w:val="both"/>
+      </w:pPr>
+      <w:r>
+        <w:t>Hệ thống chú trọng tối đa vào trải nghiệm quản trị với các kỹ thuật Frontend tiên tiến:</w:t>
+      </w:r>
+    </w:p>
+    <w:p>
+      <w:pPr>
+        <w:ind w:left="360"/>
+        <w:jc w:val="both"/>
+      </w:pPr>
+      <w:r>
+        <w:t>• Custom Confirm Context: Thay thế hộp thoại alert() thô cứng bằng kiến trúc React Context quản lý Global State kết hợp Promise, tạo Modal với Animations mượt mà.</w:t>
+      </w:r>
+    </w:p>
+    <w:p>
+      <w:pPr>
+        <w:ind w:left="360"/>
+        <w:jc w:val="both"/>
+      </w:pPr>
+      <w:r>
+        <w:t>• Thông báo Chấm Đỏ (Red Dot Badge): Sử dụng CSS animate-pulse kết hợp API Polling tự động rà soát Tổ chức bị Từ chối, hiển thị tín hiệu nhấp nháy trên thanh Điều hướng.</w:t>
+      </w:r>
+    </w:p>
+    <w:p>
+      <w:pPr>
+        <w:jc w:val="left"/>
+      </w:pPr>
+      <w:r>
+        <w:rPr>
+          <w:b/>
+          <w:sz w:val="28"/>
+        </w:rPr>
+        <w:t>6. Đóng gói Triển khai độc lập với Docker (Containerization)</w:t>
+      </w:r>
+    </w:p>
+    <w:p>
+      <w:pPr>
+        <w:jc w:val="both"/>
+      </w:pPr>
+      <w:r>
+        <w:t>Để giải quyết vấn đề xung đột môi trường, toàn bộ cấu trúc hệ thống FlexiDoc (Frontend React, Backend Node.js, MongoDB Database, ONLYOFFICE Server) đều được đóng gói thành các Docker Container. Bằng việc sử dụng docker-compose.yml, các service được quy hoạch chung một mạng nội bộ (Internal Network).</w:t>
+      </w:r>
+    </w:p>
+    <w:p>
+      <w:pPr>
+        <w:jc w:val="left"/>
+      </w:pPr>
+      <w:r>
+        <w:rPr>
+          <w:b/>
+          <w:sz w:val="28"/>
+        </w:rPr>
+        <w:t>7. Module Báo cáo Kiểm thử Tự động xuất Excel (Automated QA Excel Generation)</w:t>
+      </w:r>
+    </w:p>
+    <w:p>
+      <w:pPr>
+        <w:jc w:val="both"/>
+      </w:pPr>
+      <w:r>
+        <w:t>Một module Kiểm thử Tự động (Automated Test Suite) đã được xây dựng, tự sinh hơn 200 kịch bản kiểm thử (Test Cases). Hệ thống sử dụng thư viện exceljs xuất toàn bộ kết quả dưới dạng Bảng tính Excel hoàn chỉnh với định dạng chuyên nghiệp.</w:t>
       </w:r>
     </w:p>
     <w:sectPr>

</xml_diff>